<commit_message>
Update repository links to https://github.com/prathham-k21/MLFlow-Data-Analysis and refresh submission documents
</commit_message>
<xml_diff>
--- a/Theory-ISE2-MLFlow Data Analysis.docx
+++ b/Theory-ISE2-MLFlow Data Analysis.docx
@@ -429,7 +429,7 @@
                 <w:color w:val="003366"/>
                 <w:sz w:val="20"/>
               </w:rPr>
-              <w:t>https://github.com/prathamkadam/MLOps-MLflow-Drift-Analysis</w:t>
+              <w:t>https://github.com/prathham-k21/MLFlow-Data-Analysis</w:t>
             </w:r>
           </w:p>
         </w:tc>
@@ -2775,7 +2775,7 @@
           <w:color w:val="232323"/>
           <w:sz w:val="19"/>
         </w:rPr>
-        <w:t xml:space="preserve"> https://github.com/prathamkadam/MLOps-MLflow-Drift-Analysis</w:t>
+        <w:t xml:space="preserve"> https://github.com/prathham-k21/MLFlow-Data-Analysis</w:t>
       </w:r>
     </w:p>
     <w:p>

</xml_diff>